<commit_message>
chore(repo): archive checkpoint — commit session leftovers before the v2 restart
What changed: uncommitted theme/tables-session artifacts (fd-* probes +
ground truths + results, feature catalogs for insert/design tabs, fixture
recaptures, worklist update, retired rt-styledtable probe) committed as-is.

Why: parity-pipeline becomes the ARCHIVE branch for the v2 restart (user
decision 2026-07-01: keep pipeline + scope + the 10 OOXML fixes; archive the
Tables UI + theme work). Everything must be committed before archiving.
</commit_message>
<xml_diff>
--- a/parity/fixtures/rw-blank.docx
+++ b/parity/fixtures/rw-blank.docx
@@ -421,7 +421,7 @@
     <w:link w:val="Heading1Char"/>
     <w:uiPriority w:val="9"/>
     <w:qFormat/>
-    <w:rsid w:val="001A4B7E"/>
+    <w:rsid w:val="00BD01DC"/>
     <w:pPr>
       <w:keepNext/>
       <w:keepLines/>
@@ -444,7 +444,7 @@
     <w:semiHidden/>
     <w:unhideWhenUsed/>
     <w:qFormat/>
-    <w:rsid w:val="001A4B7E"/>
+    <w:rsid w:val="00BD01DC"/>
     <w:pPr>
       <w:keepNext/>
       <w:keepLines/>
@@ -467,7 +467,7 @@
     <w:semiHidden/>
     <w:unhideWhenUsed/>
     <w:qFormat/>
-    <w:rsid w:val="001A4B7E"/>
+    <w:rsid w:val="00BD01DC"/>
     <w:pPr>
       <w:keepNext/>
       <w:keepLines/>
@@ -490,7 +490,7 @@
     <w:semiHidden/>
     <w:unhideWhenUsed/>
     <w:qFormat/>
-    <w:rsid w:val="001A4B7E"/>
+    <w:rsid w:val="00BD01DC"/>
     <w:pPr>
       <w:keepNext/>
       <w:keepLines/>
@@ -513,7 +513,7 @@
     <w:semiHidden/>
     <w:unhideWhenUsed/>
     <w:qFormat/>
-    <w:rsid w:val="001A4B7E"/>
+    <w:rsid w:val="00BD01DC"/>
     <w:pPr>
       <w:keepNext/>
       <w:keepLines/>
@@ -534,7 +534,7 @@
     <w:semiHidden/>
     <w:unhideWhenUsed/>
     <w:qFormat/>
-    <w:rsid w:val="001A4B7E"/>
+    <w:rsid w:val="00BD01DC"/>
     <w:pPr>
       <w:keepNext/>
       <w:keepLines/>
@@ -557,7 +557,7 @@
     <w:semiHidden/>
     <w:unhideWhenUsed/>
     <w:qFormat/>
-    <w:rsid w:val="001A4B7E"/>
+    <w:rsid w:val="00BD01DC"/>
     <w:pPr>
       <w:keepNext/>
       <w:keepLines/>
@@ -578,7 +578,7 @@
     <w:semiHidden/>
     <w:unhideWhenUsed/>
     <w:qFormat/>
-    <w:rsid w:val="001A4B7E"/>
+    <w:rsid w:val="00BD01DC"/>
     <w:pPr>
       <w:keepNext/>
       <w:keepLines/>
@@ -601,7 +601,7 @@
     <w:semiHidden/>
     <w:unhideWhenUsed/>
     <w:qFormat/>
-    <w:rsid w:val="001A4B7E"/>
+    <w:rsid w:val="00BD01DC"/>
     <w:pPr>
       <w:keepNext/>
       <w:keepLines/>
@@ -645,7 +645,7 @@
     <w:basedOn w:val="DefaultParagraphFont"/>
     <w:link w:val="Heading1"/>
     <w:uiPriority w:val="9"/>
-    <w:rsid w:val="001A4B7E"/>
+    <w:rsid w:val="00BD01DC"/>
     <w:rPr>
       <w:rFonts w:asciiTheme="majorHAnsi" w:eastAsiaTheme="majorEastAsia" w:hAnsiTheme="majorHAnsi" w:cstheme="majorBidi"/>
       <w:color w:val="0F4761" w:themeColor="accent1" w:themeShade="BF"/>
@@ -659,7 +659,7 @@
     <w:link w:val="Heading2"/>
     <w:uiPriority w:val="9"/>
     <w:semiHidden/>
-    <w:rsid w:val="001A4B7E"/>
+    <w:rsid w:val="00BD01DC"/>
     <w:rPr>
       <w:rFonts w:asciiTheme="majorHAnsi" w:eastAsiaTheme="majorEastAsia" w:hAnsiTheme="majorHAnsi" w:cstheme="majorBidi"/>
       <w:color w:val="0F4761" w:themeColor="accent1" w:themeShade="BF"/>
@@ -673,7 +673,7 @@
     <w:link w:val="Heading3"/>
     <w:uiPriority w:val="9"/>
     <w:semiHidden/>
-    <w:rsid w:val="001A4B7E"/>
+    <w:rsid w:val="00BD01DC"/>
     <w:rPr>
       <w:rFonts w:eastAsiaTheme="majorEastAsia" w:cstheme="majorBidi"/>
       <w:color w:val="0F4761" w:themeColor="accent1" w:themeShade="BF"/>
@@ -687,7 +687,7 @@
     <w:link w:val="Heading4"/>
     <w:uiPriority w:val="9"/>
     <w:semiHidden/>
-    <w:rsid w:val="001A4B7E"/>
+    <w:rsid w:val="00BD01DC"/>
     <w:rPr>
       <w:rFonts w:eastAsiaTheme="majorEastAsia" w:cstheme="majorBidi"/>
       <w:i/>
@@ -701,7 +701,7 @@
     <w:link w:val="Heading5"/>
     <w:uiPriority w:val="9"/>
     <w:semiHidden/>
-    <w:rsid w:val="001A4B7E"/>
+    <w:rsid w:val="00BD01DC"/>
     <w:rPr>
       <w:rFonts w:eastAsiaTheme="majorEastAsia" w:cstheme="majorBidi"/>
       <w:color w:val="0F4761" w:themeColor="accent1" w:themeShade="BF"/>
@@ -713,7 +713,7 @@
     <w:link w:val="Heading6"/>
     <w:uiPriority w:val="9"/>
     <w:semiHidden/>
-    <w:rsid w:val="001A4B7E"/>
+    <w:rsid w:val="00BD01DC"/>
     <w:rPr>
       <w:rFonts w:eastAsiaTheme="majorEastAsia" w:cstheme="majorBidi"/>
       <w:i/>
@@ -727,7 +727,7 @@
     <w:link w:val="Heading7"/>
     <w:uiPriority w:val="9"/>
     <w:semiHidden/>
-    <w:rsid w:val="001A4B7E"/>
+    <w:rsid w:val="00BD01DC"/>
     <w:rPr>
       <w:rFonts w:eastAsiaTheme="majorEastAsia" w:cstheme="majorBidi"/>
       <w:color w:val="595959" w:themeColor="text1" w:themeTint="A6"/>
@@ -739,7 +739,7 @@
     <w:link w:val="Heading8"/>
     <w:uiPriority w:val="9"/>
     <w:semiHidden/>
-    <w:rsid w:val="001A4B7E"/>
+    <w:rsid w:val="00BD01DC"/>
     <w:rPr>
       <w:rFonts w:eastAsiaTheme="majorEastAsia" w:cstheme="majorBidi"/>
       <w:i/>
@@ -753,7 +753,7 @@
     <w:link w:val="Heading9"/>
     <w:uiPriority w:val="9"/>
     <w:semiHidden/>
-    <w:rsid w:val="001A4B7E"/>
+    <w:rsid w:val="00BD01DC"/>
     <w:rPr>
       <w:rFonts w:eastAsiaTheme="majorEastAsia" w:cstheme="majorBidi"/>
       <w:color w:val="272727" w:themeColor="text1" w:themeTint="D8"/>
@@ -766,7 +766,7 @@
     <w:link w:val="TitleChar"/>
     <w:uiPriority w:val="10"/>
     <w:qFormat/>
-    <w:rsid w:val="001A4B7E"/>
+    <w:rsid w:val="00BD01DC"/>
     <w:pPr>
       <w:spacing w:after="80" w:line="240" w:lineRule="auto"/>
       <w:contextualSpacing/>
@@ -784,7 +784,7 @@
     <w:basedOn w:val="DefaultParagraphFont"/>
     <w:link w:val="Title"/>
     <w:uiPriority w:val="10"/>
-    <w:rsid w:val="001A4B7E"/>
+    <w:rsid w:val="00BD01DC"/>
     <w:rPr>
       <w:rFonts w:asciiTheme="majorHAnsi" w:eastAsiaTheme="majorEastAsia" w:hAnsiTheme="majorHAnsi" w:cstheme="majorBidi"/>
       <w:spacing w:val="-10"/>
@@ -800,7 +800,7 @@
     <w:link w:val="SubtitleChar"/>
     <w:uiPriority w:val="11"/>
     <w:qFormat/>
-    <w:rsid w:val="001A4B7E"/>
+    <w:rsid w:val="00BD01DC"/>
     <w:pPr>
       <w:numPr>
         <w:ilvl w:val="1"/>
@@ -819,7 +819,7 @@
     <w:basedOn w:val="DefaultParagraphFont"/>
     <w:link w:val="Subtitle"/>
     <w:uiPriority w:val="11"/>
-    <w:rsid w:val="001A4B7E"/>
+    <w:rsid w:val="00BD01DC"/>
     <w:rPr>
       <w:rFonts w:eastAsiaTheme="majorEastAsia" w:cstheme="majorBidi"/>
       <w:color w:val="595959" w:themeColor="text1" w:themeTint="A6"/>
@@ -835,7 +835,7 @@
     <w:link w:val="QuoteChar"/>
     <w:uiPriority w:val="29"/>
     <w:qFormat/>
-    <w:rsid w:val="001A4B7E"/>
+    <w:rsid w:val="00BD01DC"/>
     <w:pPr>
       <w:spacing w:before="160"/>
       <w:jc w:val="center"/>
@@ -851,7 +851,7 @@
     <w:basedOn w:val="DefaultParagraphFont"/>
     <w:link w:val="Quote"/>
     <w:uiPriority w:val="29"/>
-    <w:rsid w:val="001A4B7E"/>
+    <w:rsid w:val="00BD01DC"/>
     <w:rPr>
       <w:i/>
       <w:iCs/>
@@ -863,7 +863,7 @@
     <w:basedOn w:val="Normal"/>
     <w:uiPriority w:val="34"/>
     <w:qFormat/>
-    <w:rsid w:val="001A4B7E"/>
+    <w:rsid w:val="00BD01DC"/>
     <w:pPr>
       <w:ind w:left="720"/>
       <w:contextualSpacing/>
@@ -874,7 +874,7 @@
     <w:basedOn w:val="DefaultParagraphFont"/>
     <w:uiPriority w:val="21"/>
     <w:qFormat/>
-    <w:rsid w:val="001A4B7E"/>
+    <w:rsid w:val="00BD01DC"/>
     <w:rPr>
       <w:i/>
       <w:iCs/>
@@ -888,7 +888,7 @@
     <w:link w:val="IntenseQuoteChar"/>
     <w:uiPriority w:val="30"/>
     <w:qFormat/>
-    <w:rsid w:val="001A4B7E"/>
+    <w:rsid w:val="00BD01DC"/>
     <w:pPr>
       <w:pBdr>
         <w:top w:val="single" w:sz="4" w:space="10" w:color="0F4761" w:themeColor="accent1" w:themeShade="BF"/>
@@ -909,7 +909,7 @@
     <w:basedOn w:val="DefaultParagraphFont"/>
     <w:link w:val="IntenseQuote"/>
     <w:uiPriority w:val="30"/>
-    <w:rsid w:val="001A4B7E"/>
+    <w:rsid w:val="00BD01DC"/>
     <w:rPr>
       <w:i/>
       <w:iCs/>
@@ -921,7 +921,7 @@
     <w:basedOn w:val="DefaultParagraphFont"/>
     <w:uiPriority w:val="32"/>
     <w:qFormat/>
-    <w:rsid w:val="001A4B7E"/>
+    <w:rsid w:val="00BD01DC"/>
     <w:rPr>
       <w:b/>
       <w:bCs/>

</xml_diff>

<commit_message>
test(repo): v2 four-axis baseline — OOXML + SCORECARD recaptured, feature ledger live
What changed:
- Recaptured on v2: empty-doc baselines + all 58 wc-* clone fixtures +
  the whole-ribbon scorecard; ran the OOXML differ.
- OOXML: 54/58 semantic-pass — the 10 cherry-picked fixes HOLD on the clean
  v2 clone; 4 known gaps remain (bullets/highlight/pagenum/table class).
- SCORECARD v2: 210 pass / 2 DEAD / 28 triage (of 244).
- FEATURE LEDGER (per locked feature): OOXML 13 pass/4 gap/94 unmeasured;
  STRUCT 80/19/12; STATE 95/16; SCORE 97 pass/1 DEAD/13 triage;
  VISUAL+BEHAV unmeasured. FULLY VERIFIED: 0/111 — the honest baseline that
  Phase B/C work will raise.

Why: the multi-axis ledger now reports real measured verdicts on four of six
axes; single-axis 'complete' is structurally impossible.
</commit_message>
<xml_diff>
--- a/parity/fixtures/rw-blank.docx
+++ b/parity/fixtures/rw-blank.docx
@@ -421,7 +421,7 @@
     <w:link w:val="Heading1Char"/>
     <w:uiPriority w:val="9"/>
     <w:qFormat/>
-    <w:rsid w:val="00BD01DC"/>
+    <w:rsid w:val="00DE6636"/>
     <w:pPr>
       <w:keepNext/>
       <w:keepLines/>
@@ -444,7 +444,7 @@
     <w:semiHidden/>
     <w:unhideWhenUsed/>
     <w:qFormat/>
-    <w:rsid w:val="00BD01DC"/>
+    <w:rsid w:val="00DE6636"/>
     <w:pPr>
       <w:keepNext/>
       <w:keepLines/>
@@ -467,7 +467,7 @@
     <w:semiHidden/>
     <w:unhideWhenUsed/>
     <w:qFormat/>
-    <w:rsid w:val="00BD01DC"/>
+    <w:rsid w:val="00DE6636"/>
     <w:pPr>
       <w:keepNext/>
       <w:keepLines/>
@@ -490,7 +490,7 @@
     <w:semiHidden/>
     <w:unhideWhenUsed/>
     <w:qFormat/>
-    <w:rsid w:val="00BD01DC"/>
+    <w:rsid w:val="00DE6636"/>
     <w:pPr>
       <w:keepNext/>
       <w:keepLines/>
@@ -513,7 +513,7 @@
     <w:semiHidden/>
     <w:unhideWhenUsed/>
     <w:qFormat/>
-    <w:rsid w:val="00BD01DC"/>
+    <w:rsid w:val="00DE6636"/>
     <w:pPr>
       <w:keepNext/>
       <w:keepLines/>
@@ -534,7 +534,7 @@
     <w:semiHidden/>
     <w:unhideWhenUsed/>
     <w:qFormat/>
-    <w:rsid w:val="00BD01DC"/>
+    <w:rsid w:val="00DE6636"/>
     <w:pPr>
       <w:keepNext/>
       <w:keepLines/>
@@ -557,7 +557,7 @@
     <w:semiHidden/>
     <w:unhideWhenUsed/>
     <w:qFormat/>
-    <w:rsid w:val="00BD01DC"/>
+    <w:rsid w:val="00DE6636"/>
     <w:pPr>
       <w:keepNext/>
       <w:keepLines/>
@@ -578,7 +578,7 @@
     <w:semiHidden/>
     <w:unhideWhenUsed/>
     <w:qFormat/>
-    <w:rsid w:val="00BD01DC"/>
+    <w:rsid w:val="00DE6636"/>
     <w:pPr>
       <w:keepNext/>
       <w:keepLines/>
@@ -601,7 +601,7 @@
     <w:semiHidden/>
     <w:unhideWhenUsed/>
     <w:qFormat/>
-    <w:rsid w:val="00BD01DC"/>
+    <w:rsid w:val="00DE6636"/>
     <w:pPr>
       <w:keepNext/>
       <w:keepLines/>
@@ -645,7 +645,7 @@
     <w:basedOn w:val="DefaultParagraphFont"/>
     <w:link w:val="Heading1"/>
     <w:uiPriority w:val="9"/>
-    <w:rsid w:val="00BD01DC"/>
+    <w:rsid w:val="00DE6636"/>
     <w:rPr>
       <w:rFonts w:asciiTheme="majorHAnsi" w:eastAsiaTheme="majorEastAsia" w:hAnsiTheme="majorHAnsi" w:cstheme="majorBidi"/>
       <w:color w:val="0F4761" w:themeColor="accent1" w:themeShade="BF"/>
@@ -659,7 +659,7 @@
     <w:link w:val="Heading2"/>
     <w:uiPriority w:val="9"/>
     <w:semiHidden/>
-    <w:rsid w:val="00BD01DC"/>
+    <w:rsid w:val="00DE6636"/>
     <w:rPr>
       <w:rFonts w:asciiTheme="majorHAnsi" w:eastAsiaTheme="majorEastAsia" w:hAnsiTheme="majorHAnsi" w:cstheme="majorBidi"/>
       <w:color w:val="0F4761" w:themeColor="accent1" w:themeShade="BF"/>
@@ -673,7 +673,7 @@
     <w:link w:val="Heading3"/>
     <w:uiPriority w:val="9"/>
     <w:semiHidden/>
-    <w:rsid w:val="00BD01DC"/>
+    <w:rsid w:val="00DE6636"/>
     <w:rPr>
       <w:rFonts w:eastAsiaTheme="majorEastAsia" w:cstheme="majorBidi"/>
       <w:color w:val="0F4761" w:themeColor="accent1" w:themeShade="BF"/>
@@ -687,7 +687,7 @@
     <w:link w:val="Heading4"/>
     <w:uiPriority w:val="9"/>
     <w:semiHidden/>
-    <w:rsid w:val="00BD01DC"/>
+    <w:rsid w:val="00DE6636"/>
     <w:rPr>
       <w:rFonts w:eastAsiaTheme="majorEastAsia" w:cstheme="majorBidi"/>
       <w:i/>
@@ -701,7 +701,7 @@
     <w:link w:val="Heading5"/>
     <w:uiPriority w:val="9"/>
     <w:semiHidden/>
-    <w:rsid w:val="00BD01DC"/>
+    <w:rsid w:val="00DE6636"/>
     <w:rPr>
       <w:rFonts w:eastAsiaTheme="majorEastAsia" w:cstheme="majorBidi"/>
       <w:color w:val="0F4761" w:themeColor="accent1" w:themeShade="BF"/>
@@ -713,7 +713,7 @@
     <w:link w:val="Heading6"/>
     <w:uiPriority w:val="9"/>
     <w:semiHidden/>
-    <w:rsid w:val="00BD01DC"/>
+    <w:rsid w:val="00DE6636"/>
     <w:rPr>
       <w:rFonts w:eastAsiaTheme="majorEastAsia" w:cstheme="majorBidi"/>
       <w:i/>
@@ -727,7 +727,7 @@
     <w:link w:val="Heading7"/>
     <w:uiPriority w:val="9"/>
     <w:semiHidden/>
-    <w:rsid w:val="00BD01DC"/>
+    <w:rsid w:val="00DE6636"/>
     <w:rPr>
       <w:rFonts w:eastAsiaTheme="majorEastAsia" w:cstheme="majorBidi"/>
       <w:color w:val="595959" w:themeColor="text1" w:themeTint="A6"/>
@@ -739,7 +739,7 @@
     <w:link w:val="Heading8"/>
     <w:uiPriority w:val="9"/>
     <w:semiHidden/>
-    <w:rsid w:val="00BD01DC"/>
+    <w:rsid w:val="00DE6636"/>
     <w:rPr>
       <w:rFonts w:eastAsiaTheme="majorEastAsia" w:cstheme="majorBidi"/>
       <w:i/>
@@ -753,7 +753,7 @@
     <w:link w:val="Heading9"/>
     <w:uiPriority w:val="9"/>
     <w:semiHidden/>
-    <w:rsid w:val="00BD01DC"/>
+    <w:rsid w:val="00DE6636"/>
     <w:rPr>
       <w:rFonts w:eastAsiaTheme="majorEastAsia" w:cstheme="majorBidi"/>
       <w:color w:val="272727" w:themeColor="text1" w:themeTint="D8"/>
@@ -766,7 +766,7 @@
     <w:link w:val="TitleChar"/>
     <w:uiPriority w:val="10"/>
     <w:qFormat/>
-    <w:rsid w:val="00BD01DC"/>
+    <w:rsid w:val="00DE6636"/>
     <w:pPr>
       <w:spacing w:after="80" w:line="240" w:lineRule="auto"/>
       <w:contextualSpacing/>
@@ -784,7 +784,7 @@
     <w:basedOn w:val="DefaultParagraphFont"/>
     <w:link w:val="Title"/>
     <w:uiPriority w:val="10"/>
-    <w:rsid w:val="00BD01DC"/>
+    <w:rsid w:val="00DE6636"/>
     <w:rPr>
       <w:rFonts w:asciiTheme="majorHAnsi" w:eastAsiaTheme="majorEastAsia" w:hAnsiTheme="majorHAnsi" w:cstheme="majorBidi"/>
       <w:spacing w:val="-10"/>
@@ -800,7 +800,7 @@
     <w:link w:val="SubtitleChar"/>
     <w:uiPriority w:val="11"/>
     <w:qFormat/>
-    <w:rsid w:val="00BD01DC"/>
+    <w:rsid w:val="00DE6636"/>
     <w:pPr>
       <w:numPr>
         <w:ilvl w:val="1"/>
@@ -819,7 +819,7 @@
     <w:basedOn w:val="DefaultParagraphFont"/>
     <w:link w:val="Subtitle"/>
     <w:uiPriority w:val="11"/>
-    <w:rsid w:val="00BD01DC"/>
+    <w:rsid w:val="00DE6636"/>
     <w:rPr>
       <w:rFonts w:eastAsiaTheme="majorEastAsia" w:cstheme="majorBidi"/>
       <w:color w:val="595959" w:themeColor="text1" w:themeTint="A6"/>
@@ -835,7 +835,7 @@
     <w:link w:val="QuoteChar"/>
     <w:uiPriority w:val="29"/>
     <w:qFormat/>
-    <w:rsid w:val="00BD01DC"/>
+    <w:rsid w:val="00DE6636"/>
     <w:pPr>
       <w:spacing w:before="160"/>
       <w:jc w:val="center"/>
@@ -851,7 +851,7 @@
     <w:basedOn w:val="DefaultParagraphFont"/>
     <w:link w:val="Quote"/>
     <w:uiPriority w:val="29"/>
-    <w:rsid w:val="00BD01DC"/>
+    <w:rsid w:val="00DE6636"/>
     <w:rPr>
       <w:i/>
       <w:iCs/>
@@ -863,7 +863,7 @@
     <w:basedOn w:val="Normal"/>
     <w:uiPriority w:val="34"/>
     <w:qFormat/>
-    <w:rsid w:val="00BD01DC"/>
+    <w:rsid w:val="00DE6636"/>
     <w:pPr>
       <w:ind w:left="720"/>
       <w:contextualSpacing/>
@@ -874,7 +874,7 @@
     <w:basedOn w:val="DefaultParagraphFont"/>
     <w:uiPriority w:val="21"/>
     <w:qFormat/>
-    <w:rsid w:val="00BD01DC"/>
+    <w:rsid w:val="00DE6636"/>
     <w:rPr>
       <w:i/>
       <w:iCs/>
@@ -888,7 +888,7 @@
     <w:link w:val="IntenseQuoteChar"/>
     <w:uiPriority w:val="30"/>
     <w:qFormat/>
-    <w:rsid w:val="00BD01DC"/>
+    <w:rsid w:val="00DE6636"/>
     <w:pPr>
       <w:pBdr>
         <w:top w:val="single" w:sz="4" w:space="10" w:color="0F4761" w:themeColor="accent1" w:themeShade="BF"/>
@@ -909,7 +909,7 @@
     <w:basedOn w:val="DefaultParagraphFont"/>
     <w:link w:val="IntenseQuote"/>
     <w:uiPriority w:val="30"/>
-    <w:rsid w:val="00BD01DC"/>
+    <w:rsid w:val="00DE6636"/>
     <w:rPr>
       <w:i/>
       <w:iCs/>
@@ -921,7 +921,7 @@
     <w:basedOn w:val="DefaultParagraphFont"/>
     <w:uiPriority w:val="32"/>
     <w:qFormat/>
-    <w:rsid w:val="00BD01DC"/>
+    <w:rsid w:val="00DE6636"/>
     <w:rPr>
       <w:b/>
       <w:bCs/>

</xml_diff>